<commit_message>
Fix Word lesson cards cut off on the right
Use normal page margins instead of zero margins with a full-page-wide
table, and switch to the Word 2013+ layout mode, so the cards fit on
the page in every Word version.

Co-Authored-By: Claude Opus 5.5 <noreply@anthropic.com>
Claude-Session: https://claude.ai/code/session_01Cgb566i6yU5MkPKD33gaGv
</commit_message>
<xml_diff>
--- a/TopBal-Autorijschool/leskaart/Leskaart TopBal nieuw - printklaar.docx
+++ b/TopBal-Autorijschool/leskaart/Leskaart TopBal nieuw - printklaar.docx
@@ -44,7 +44,7 @@
     </w:p>
     <w:tbl>
       <w:tblPr>
-        <w:tblW w:w="10780" w:type="dxa"/>
+        <w:tblW w:w="10720" w:type="dxa"/>
         <w:tblInd w:w="0" w:type="dxa"/>
         <w:tblBorders>
           <w:top w:val="single" w:sz="6" w:space="0" w:color="000000"/>
@@ -64,7 +64,7 @@
       </w:tblPr>
       <w:tblGrid>
         <w:gridCol w:w="4260"/>
-        <w:gridCol w:w="6520"/>
+        <w:gridCol w:w="6460"/>
       </w:tblGrid>
       <w:tr>
         <w:trPr>
@@ -181,7 +181,7 @@
         </w:tc>
         <w:tc>
           <w:tcPr>
-            <w:tcW w:type="dxa" w:w="6520"/>
+            <w:tcW w:type="dxa" w:w="6460"/>
             <w:vAlign w:val="top"/>
           </w:tcPr>
           <w:p>
@@ -309,7 +309,7 @@
     </w:p>
     <w:tbl>
       <w:tblPr>
-        <w:tblW w:w="10770" w:type="dxa"/>
+        <w:tblW w:w="10710" w:type="dxa"/>
         <w:tblInd w:w="0" w:type="dxa"/>
         <w:tblBorders>
           <w:top w:val="single" w:sz="6" w:space="0" w:color="000000"/>
@@ -332,7 +332,7 @@
         <w:gridCol w:w="5210"/>
         <w:gridCol w:w="580"/>
         <w:gridCol w:w="560"/>
-        <w:gridCol w:w="3980"/>
+        <w:gridCol w:w="3920"/>
       </w:tblGrid>
       <w:tr>
         <w:trPr>
@@ -380,7 +380,7 @@
         </w:tc>
         <w:tc>
           <w:tcPr>
-            <w:tcW w:type="dxa" w:w="3980"/>
+            <w:tcW w:type="dxa" w:w="3920"/>
             <w:tcBorders>
               <w:left w:val="nil"/>
             </w:tcBorders>
@@ -484,7 +484,7 @@
         </w:tc>
         <w:tc>
           <w:tcPr>
-            <w:tcW w:type="dxa" w:w="3980"/>
+            <w:tcW w:type="dxa" w:w="3920"/>
             <w:vAlign w:val="center"/>
           </w:tcPr>
           <w:p>
@@ -576,7 +576,7 @@
         </w:tc>
         <w:tc>
           <w:tcPr>
-            <w:tcW w:type="dxa" w:w="3980"/>
+            <w:tcW w:type="dxa" w:w="3920"/>
             <w:vAlign w:val="center"/>
           </w:tcPr>
           <w:p>
@@ -668,7 +668,7 @@
         </w:tc>
         <w:tc>
           <w:tcPr>
-            <w:tcW w:type="dxa" w:w="3980"/>
+            <w:tcW w:type="dxa" w:w="3920"/>
             <w:vAlign w:val="center"/>
           </w:tcPr>
           <w:p>
@@ -760,7 +760,7 @@
         </w:tc>
         <w:tc>
           <w:tcPr>
-            <w:tcW w:type="dxa" w:w="3980"/>
+            <w:tcW w:type="dxa" w:w="3920"/>
             <w:vAlign w:val="center"/>
           </w:tcPr>
           <w:p>
@@ -782,7 +782,7 @@
     </w:p>
     <w:tbl>
       <w:tblPr>
-        <w:tblW w:w="10770" w:type="dxa"/>
+        <w:tblW w:w="10710" w:type="dxa"/>
         <w:tblInd w:w="0" w:type="dxa"/>
         <w:tblBorders>
           <w:top w:val="single" w:sz="6" w:space="0" w:color="000000"/>
@@ -805,7 +805,7 @@
         <w:gridCol w:w="5210"/>
         <w:gridCol w:w="580"/>
         <w:gridCol w:w="560"/>
-        <w:gridCol w:w="3980"/>
+        <w:gridCol w:w="3920"/>
       </w:tblGrid>
       <w:tr>
         <w:trPr>
@@ -853,7 +853,7 @@
         </w:tc>
         <w:tc>
           <w:tcPr>
-            <w:tcW w:type="dxa" w:w="3980"/>
+            <w:tcW w:type="dxa" w:w="3920"/>
             <w:tcBorders>
               <w:left w:val="nil"/>
             </w:tcBorders>
@@ -957,7 +957,7 @@
         </w:tc>
         <w:tc>
           <w:tcPr>
-            <w:tcW w:type="dxa" w:w="3980"/>
+            <w:tcW w:type="dxa" w:w="3920"/>
             <w:vAlign w:val="center"/>
           </w:tcPr>
           <w:p>
@@ -1049,7 +1049,7 @@
         </w:tc>
         <w:tc>
           <w:tcPr>
-            <w:tcW w:type="dxa" w:w="3980"/>
+            <w:tcW w:type="dxa" w:w="3920"/>
             <w:vAlign w:val="center"/>
           </w:tcPr>
           <w:p>
@@ -1141,7 +1141,7 @@
         </w:tc>
         <w:tc>
           <w:tcPr>
-            <w:tcW w:type="dxa" w:w="3980"/>
+            <w:tcW w:type="dxa" w:w="3920"/>
             <w:vAlign w:val="center"/>
           </w:tcPr>
           <w:p>
@@ -1233,7 +1233,7 @@
         </w:tc>
         <w:tc>
           <w:tcPr>
-            <w:tcW w:type="dxa" w:w="3980"/>
+            <w:tcW w:type="dxa" w:w="3920"/>
             <w:vAlign w:val="center"/>
           </w:tcPr>
           <w:p>
@@ -1325,7 +1325,7 @@
         </w:tc>
         <w:tc>
           <w:tcPr>
-            <w:tcW w:type="dxa" w:w="3980"/>
+            <w:tcW w:type="dxa" w:w="3920"/>
             <w:vAlign w:val="center"/>
           </w:tcPr>
           <w:p>
@@ -1417,7 +1417,7 @@
         </w:tc>
         <w:tc>
           <w:tcPr>
-            <w:tcW w:type="dxa" w:w="3980"/>
+            <w:tcW w:type="dxa" w:w="3920"/>
             <w:vAlign w:val="center"/>
           </w:tcPr>
           <w:p>
@@ -1509,7 +1509,7 @@
         </w:tc>
         <w:tc>
           <w:tcPr>
-            <w:tcW w:type="dxa" w:w="3980"/>
+            <w:tcW w:type="dxa" w:w="3920"/>
             <w:vAlign w:val="center"/>
           </w:tcPr>
           <w:p>
@@ -1601,7 +1601,7 @@
         </w:tc>
         <w:tc>
           <w:tcPr>
-            <w:tcW w:type="dxa" w:w="3980"/>
+            <w:tcW w:type="dxa" w:w="3920"/>
             <w:vAlign w:val="center"/>
           </w:tcPr>
           <w:p>
@@ -1693,7 +1693,7 @@
         </w:tc>
         <w:tc>
           <w:tcPr>
-            <w:tcW w:type="dxa" w:w="3980"/>
+            <w:tcW w:type="dxa" w:w="3920"/>
             <w:vAlign w:val="center"/>
           </w:tcPr>
           <w:p>
@@ -1785,7 +1785,7 @@
         </w:tc>
         <w:tc>
           <w:tcPr>
-            <w:tcW w:type="dxa" w:w="3980"/>
+            <w:tcW w:type="dxa" w:w="3920"/>
             <w:vAlign w:val="center"/>
           </w:tcPr>
           <w:p>
@@ -1877,7 +1877,7 @@
         </w:tc>
         <w:tc>
           <w:tcPr>
-            <w:tcW w:type="dxa" w:w="3980"/>
+            <w:tcW w:type="dxa" w:w="3920"/>
             <w:vAlign w:val="center"/>
           </w:tcPr>
           <w:p>
@@ -1969,7 +1969,7 @@
         </w:tc>
         <w:tc>
           <w:tcPr>
-            <w:tcW w:type="dxa" w:w="3980"/>
+            <w:tcW w:type="dxa" w:w="3920"/>
             <w:vAlign w:val="center"/>
           </w:tcPr>
           <w:p>
@@ -2061,7 +2061,7 @@
         </w:tc>
         <w:tc>
           <w:tcPr>
-            <w:tcW w:type="dxa" w:w="3980"/>
+            <w:tcW w:type="dxa" w:w="3920"/>
             <w:vAlign w:val="center"/>
           </w:tcPr>
           <w:p>
@@ -2083,7 +2083,7 @@
     </w:p>
     <w:tbl>
       <w:tblPr>
-        <w:tblW w:w="10770" w:type="dxa"/>
+        <w:tblW w:w="10710" w:type="dxa"/>
         <w:tblInd w:w="0" w:type="dxa"/>
         <w:tblBorders>
           <w:top w:val="single" w:sz="6" w:space="0" w:color="000000"/>
@@ -2106,7 +2106,7 @@
         <w:gridCol w:w="5210"/>
         <w:gridCol w:w="580"/>
         <w:gridCol w:w="560"/>
-        <w:gridCol w:w="3980"/>
+        <w:gridCol w:w="3920"/>
       </w:tblGrid>
       <w:tr>
         <w:trPr>
@@ -2154,7 +2154,7 @@
         </w:tc>
         <w:tc>
           <w:tcPr>
-            <w:tcW w:type="dxa" w:w="3980"/>
+            <w:tcW w:type="dxa" w:w="3920"/>
             <w:tcBorders>
               <w:left w:val="nil"/>
             </w:tcBorders>
@@ -2258,7 +2258,7 @@
         </w:tc>
         <w:tc>
           <w:tcPr>
-            <w:tcW w:type="dxa" w:w="3980"/>
+            <w:tcW w:type="dxa" w:w="3920"/>
             <w:vAlign w:val="center"/>
           </w:tcPr>
           <w:p>
@@ -2350,7 +2350,7 @@
         </w:tc>
         <w:tc>
           <w:tcPr>
-            <w:tcW w:type="dxa" w:w="3980"/>
+            <w:tcW w:type="dxa" w:w="3920"/>
             <w:vAlign w:val="center"/>
           </w:tcPr>
           <w:p>
@@ -2442,7 +2442,7 @@
         </w:tc>
         <w:tc>
           <w:tcPr>
-            <w:tcW w:type="dxa" w:w="3980"/>
+            <w:tcW w:type="dxa" w:w="3920"/>
             <w:vAlign w:val="center"/>
           </w:tcPr>
           <w:p>
@@ -2534,7 +2534,7 @@
         </w:tc>
         <w:tc>
           <w:tcPr>
-            <w:tcW w:type="dxa" w:w="3980"/>
+            <w:tcW w:type="dxa" w:w="3920"/>
             <w:vAlign w:val="center"/>
           </w:tcPr>
           <w:p>
@@ -2626,7 +2626,7 @@
         </w:tc>
         <w:tc>
           <w:tcPr>
-            <w:tcW w:type="dxa" w:w="3980"/>
+            <w:tcW w:type="dxa" w:w="3920"/>
             <w:vAlign w:val="center"/>
           </w:tcPr>
           <w:p>
@@ -2718,7 +2718,7 @@
         </w:tc>
         <w:tc>
           <w:tcPr>
-            <w:tcW w:type="dxa" w:w="3980"/>
+            <w:tcW w:type="dxa" w:w="3920"/>
             <w:vAlign w:val="center"/>
           </w:tcPr>
           <w:p>
@@ -2810,7 +2810,7 @@
         </w:tc>
         <w:tc>
           <w:tcPr>
-            <w:tcW w:type="dxa" w:w="3980"/>
+            <w:tcW w:type="dxa" w:w="3920"/>
             <w:vAlign w:val="center"/>
           </w:tcPr>
           <w:p>
@@ -3035,7 +3035,7 @@
     </w:p>
     <w:tbl>
       <w:tblPr>
-        <w:tblW w:w="10780" w:type="dxa"/>
+        <w:tblW w:w="10720" w:type="dxa"/>
         <w:tblInd w:w="0" w:type="dxa"/>
         <w:tblBorders>
           <w:top w:val="single" w:sz="6" w:space="0" w:color="000000"/>
@@ -3058,7 +3058,7 @@
         <w:gridCol w:w="5110"/>
         <w:gridCol w:w="560"/>
         <w:gridCol w:w="540"/>
-        <w:gridCol w:w="4130"/>
+        <w:gridCol w:w="4070"/>
       </w:tblGrid>
       <w:tr>
         <w:trPr>
@@ -3106,7 +3106,7 @@
         </w:tc>
         <w:tc>
           <w:tcPr>
-            <w:tcW w:type="dxa" w:w="4130"/>
+            <w:tcW w:type="dxa" w:w="4070"/>
             <w:tcBorders>
               <w:left w:val="nil"/>
             </w:tcBorders>
@@ -3210,7 +3210,7 @@
         </w:tc>
         <w:tc>
           <w:tcPr>
-            <w:tcW w:type="dxa" w:w="4130"/>
+            <w:tcW w:type="dxa" w:w="4070"/>
             <w:vAlign w:val="center"/>
           </w:tcPr>
           <w:p>
@@ -3302,7 +3302,7 @@
         </w:tc>
         <w:tc>
           <w:tcPr>
-            <w:tcW w:type="dxa" w:w="4130"/>
+            <w:tcW w:type="dxa" w:w="4070"/>
             <w:vAlign w:val="center"/>
           </w:tcPr>
           <w:p>
@@ -3324,7 +3324,7 @@
     </w:p>
     <w:tbl>
       <w:tblPr>
-        <w:tblW w:w="10780" w:type="dxa"/>
+        <w:tblW w:w="10720" w:type="dxa"/>
         <w:tblInd w:w="0" w:type="dxa"/>
         <w:tblBorders>
           <w:top w:val="single" w:sz="6" w:space="0" w:color="000000"/>
@@ -3347,7 +3347,7 @@
         <w:gridCol w:w="5110"/>
         <w:gridCol w:w="560"/>
         <w:gridCol w:w="540"/>
-        <w:gridCol w:w="4130"/>
+        <w:gridCol w:w="4070"/>
       </w:tblGrid>
       <w:tr>
         <w:trPr>
@@ -3395,7 +3395,7 @@
         </w:tc>
         <w:tc>
           <w:tcPr>
-            <w:tcW w:type="dxa" w:w="4130"/>
+            <w:tcW w:type="dxa" w:w="4070"/>
             <w:tcBorders>
               <w:left w:val="nil"/>
             </w:tcBorders>
@@ -3499,7 +3499,7 @@
         </w:tc>
         <w:tc>
           <w:tcPr>
-            <w:tcW w:type="dxa" w:w="4130"/>
+            <w:tcW w:type="dxa" w:w="4070"/>
             <w:vAlign w:val="center"/>
           </w:tcPr>
           <w:p>
@@ -3591,7 +3591,7 @@
         </w:tc>
         <w:tc>
           <w:tcPr>
-            <w:tcW w:type="dxa" w:w="4130"/>
+            <w:tcW w:type="dxa" w:w="4070"/>
             <w:vAlign w:val="center"/>
           </w:tcPr>
           <w:p>
@@ -3683,7 +3683,7 @@
         </w:tc>
         <w:tc>
           <w:tcPr>
-            <w:tcW w:type="dxa" w:w="4130"/>
+            <w:tcW w:type="dxa" w:w="4070"/>
             <w:vAlign w:val="center"/>
           </w:tcPr>
           <w:p>
@@ -3775,7 +3775,7 @@
         </w:tc>
         <w:tc>
           <w:tcPr>
-            <w:tcW w:type="dxa" w:w="4130"/>
+            <w:tcW w:type="dxa" w:w="4070"/>
             <w:vAlign w:val="center"/>
           </w:tcPr>
           <w:p>
@@ -3867,7 +3867,7 @@
         </w:tc>
         <w:tc>
           <w:tcPr>
-            <w:tcW w:type="dxa" w:w="4130"/>
+            <w:tcW w:type="dxa" w:w="4070"/>
             <w:vAlign w:val="center"/>
           </w:tcPr>
           <w:p>
@@ -3889,7 +3889,7 @@
     </w:p>
     <w:tbl>
       <w:tblPr>
-        <w:tblW w:w="10780" w:type="dxa"/>
+        <w:tblW w:w="10720" w:type="dxa"/>
         <w:tblInd w:w="0" w:type="dxa"/>
         <w:tblBorders>
           <w:top w:val="single" w:sz="6" w:space="0" w:color="000000"/>
@@ -3912,7 +3912,7 @@
         <w:gridCol w:w="5110"/>
         <w:gridCol w:w="560"/>
         <w:gridCol w:w="540"/>
-        <w:gridCol w:w="4130"/>
+        <w:gridCol w:w="4070"/>
       </w:tblGrid>
       <w:tr>
         <w:trPr>
@@ -3960,7 +3960,7 @@
         </w:tc>
         <w:tc>
           <w:tcPr>
-            <w:tcW w:type="dxa" w:w="4130"/>
+            <w:tcW w:type="dxa" w:w="4070"/>
             <w:tcBorders>
               <w:left w:val="nil"/>
             </w:tcBorders>
@@ -4064,7 +4064,7 @@
         </w:tc>
         <w:tc>
           <w:tcPr>
-            <w:tcW w:type="dxa" w:w="4130"/>
+            <w:tcW w:type="dxa" w:w="4070"/>
             <w:vAlign w:val="center"/>
           </w:tcPr>
           <w:p>
@@ -4156,7 +4156,7 @@
         </w:tc>
         <w:tc>
           <w:tcPr>
-            <w:tcW w:type="dxa" w:w="4130"/>
+            <w:tcW w:type="dxa" w:w="4070"/>
             <w:vAlign w:val="center"/>
           </w:tcPr>
           <w:p>
@@ -4248,7 +4248,7 @@
         </w:tc>
         <w:tc>
           <w:tcPr>
-            <w:tcW w:type="dxa" w:w="4130"/>
+            <w:tcW w:type="dxa" w:w="4070"/>
             <w:vAlign w:val="center"/>
           </w:tcPr>
           <w:p>
@@ -4340,7 +4340,7 @@
         </w:tc>
         <w:tc>
           <w:tcPr>
-            <w:tcW w:type="dxa" w:w="4130"/>
+            <w:tcW w:type="dxa" w:w="4070"/>
             <w:vAlign w:val="center"/>
           </w:tcPr>
           <w:p>
@@ -4432,7 +4432,7 @@
         </w:tc>
         <w:tc>
           <w:tcPr>
-            <w:tcW w:type="dxa" w:w="4130"/>
+            <w:tcW w:type="dxa" w:w="4070"/>
             <w:vAlign w:val="center"/>
           </w:tcPr>
           <w:p>

</xml_diff>